<commit_message>
build(handouts): generate sheet PDFs and Word files for the revised course day
Co-Authored-By: Claude Haiku 5.5 <noreply@anthropic.com>
</commit_message>
<xml_diff>
--- a/assets/handouts/risk-worksheet.docx
+++ b/assets/handouts/risk-worksheet.docx
@@ -23,7 +23,7 @@
         <w:pStyle w:val="FirstParagraph"/>
       </w:pPr>
       <w:r>
-        <w:t xml:space="preserve">Use this worksheet for one actual or planned use of generative AI in your research. Fill in each field. Name a source where you can. Write</w:t>
+        <w:t xml:space="preserve">This worksheet is optional. Use it to prepare your Responsible GenAI Use Statement for your Research Use: one actual or planned use of generative AI in your research. Fill in each field. Name a source where you can. Write</w:t>
       </w:r>
       <w:r>
         <w:t xml:space="preserve"> </w:t>
@@ -118,7 +118,7 @@
               <w:pStyle w:val="Compact"/>
             </w:pPr>
             <w:r>
-              <w:t xml:space="preserve">Research use</w:t>
+              <w:t xml:space="preserve">Research Use</w:t>
             </w:r>
           </w:p>
         </w:tc>

</xml_diff>